<commit_message>
Print: all printing done bei Dateimeister_support.handle_print_request. some improvements for printing
</commit_message>
<xml_diff>
--- a/Requirement Print Preview.docx
+++ b/Requirement Print Preview.docx
@@ -4,129 +4,17 @@
   <w:body>
     <w:p>
       <w:r>
-        <w:t xml:space="preserve">ok, danke! Zurück zum Dateimeister. Mit der Druckfunktion bin ich zufrieden, randlos ist nicht nötig. Wer alle Optionen haben möchte, die der Druckertreiber bietet, soll eine andere Anwendung verwenden. Was mich vielleicht noch interessieren würde, wäre so eine Art digitaler Kontaktstreifen, also viele kleine Fotos auf einer Seite, aber das ist nicht erste Priorität. Was ich gern hätte: eine Klasse </w:t>
-      </w:r>
-      <w:proofErr w:type="spellStart"/>
-      <w:r>
-        <w:t>Print_preview</w:t>
-      </w:r>
-      <w:proofErr w:type="spellEnd"/>
-      <w:r>
-        <w:t xml:space="preserve">, die die Fotos, die zum Drucken ausgewählt sind, anzeigt. Ablauf: wenn der User ein Foto auswählt, wird vom Dateimeister die Klasse </w:t>
-      </w:r>
-      <w:proofErr w:type="spellStart"/>
-      <w:r>
-        <w:t>initalisiert</w:t>
-      </w:r>
-      <w:proofErr w:type="spellEnd"/>
-      <w:r>
-        <w:t xml:space="preserve">. Diese zeigt ein Fenster mit einer Canvas. Das Foto erscheint oben links. Bei jedem weiteren vom User zum Druck ausgewählten Foto wird dieses </w:t>
-      </w:r>
-      <w:proofErr w:type="gramStart"/>
-      <w:r>
-        <w:t xml:space="preserve">in der </w:t>
-      </w:r>
-      <w:proofErr w:type="spellStart"/>
-      <w:r>
-        <w:t>Print</w:t>
-      </w:r>
-      <w:proofErr w:type="gramEnd"/>
-      <w:r>
-        <w:t>_preview</w:t>
-      </w:r>
-      <w:proofErr w:type="spellEnd"/>
-      <w:r>
-        <w:t xml:space="preserve"> angezeigt, indem der Dateimeister </w:t>
-      </w:r>
-      <w:proofErr w:type="spellStart"/>
-      <w:r>
-        <w:t>print_preview.add_photo</w:t>
-      </w:r>
-      <w:proofErr w:type="spellEnd"/>
-      <w:r>
-        <w:t xml:space="preserve"> aufruft. Dieses wird dann rechts neben dem letzten angezeigten Foto in der Canvas eingefügt usw. Die </w:t>
-      </w:r>
-      <w:proofErr w:type="spellStart"/>
-      <w:r>
-        <w:t>canvas</w:t>
-      </w:r>
-      <w:proofErr w:type="spellEnd"/>
-      <w:r>
-        <w:t xml:space="preserve"> soll über Parameter gesteuert, m Zeilen und n Spalten aufweisen. Die Fotos sollen so skaliert werden, dass sie alle dieselbe Höhe haben. Die </w:t>
-      </w:r>
-      <w:proofErr w:type="spellStart"/>
-      <w:r>
-        <w:t>canvas</w:t>
-      </w:r>
-      <w:proofErr w:type="spellEnd"/>
-      <w:r>
-        <w:t xml:space="preserve"> soll über horizontale und vertikale </w:t>
-      </w:r>
-      <w:proofErr w:type="spellStart"/>
-      <w:r>
-        <w:t>Scrollbars</w:t>
-      </w:r>
-      <w:proofErr w:type="spellEnd"/>
-      <w:r>
-        <w:t xml:space="preserve"> verfügen. Es soll möglich sein, 1...n Fotos durch linken </w:t>
-      </w:r>
-      <w:proofErr w:type="spellStart"/>
-      <w:r>
-        <w:t>mausclick</w:t>
-      </w:r>
-      <w:proofErr w:type="spellEnd"/>
-      <w:r>
-        <w:t xml:space="preserve"> auszuwählen. Strg-</w:t>
-      </w:r>
-      <w:proofErr w:type="spellStart"/>
-      <w:r>
-        <w:t>left</w:t>
-      </w:r>
-      <w:proofErr w:type="spellEnd"/>
-      <w:r>
-        <w:t>-</w:t>
-      </w:r>
-      <w:proofErr w:type="spellStart"/>
-      <w:r>
-        <w:t>mouseclick</w:t>
-      </w:r>
-      <w:proofErr w:type="spellEnd"/>
-      <w:r>
-        <w:t xml:space="preserve"> soll die Auswahl ergänzen, ohne Steuerung soll das die Auswahl aufgehoben werden und nur das angeklickte Foto ausgewählt werden. Die Auswahl soll bei jedem Foto an einem gepunkteten roten Rahmen (</w:t>
-      </w:r>
-      <w:proofErr w:type="spellStart"/>
-      <w:r>
-        <w:t>rechteck</w:t>
-      </w:r>
-      <w:proofErr w:type="spellEnd"/>
-      <w:r>
-        <w:t>) erkennbar sein, der (einstellbar) jeweils 5% vom jeweiligen Bildrand angezeigt wird. Es soll folgende Buttons geben:</w:t>
-      </w:r>
-    </w:p>
-    <w:p>
-      <w:r>
-        <w:t xml:space="preserve">Delete </w:t>
-      </w:r>
-      <w:proofErr w:type="spellStart"/>
-      <w:r>
-        <w:t>selected</w:t>
-      </w:r>
-      <w:proofErr w:type="spellEnd"/>
-      <w:r>
-        <w:t xml:space="preserve"> -&gt; löscht die ausgewählten Fotos aus der Canvas, diese wird lückenlos ohne die selektierten Fotos neu aufgebaut.</w:t>
-      </w:r>
-    </w:p>
-    <w:p>
-      <w:r>
-        <w:t xml:space="preserve">Print </w:t>
-      </w:r>
-      <w:proofErr w:type="spellStart"/>
-      <w:r>
-        <w:t>selected</w:t>
-      </w:r>
-      <w:proofErr w:type="spellEnd"/>
-      <w:r>
-        <w:t xml:space="preserve"> -&gt; druckt die selektierten Fotos</w:t>
+        <w:t>ok, danke! Zurück zum Dateimeister. Mit der Druckfunktion bin ich zufrieden, randlos ist nicht nötig. Wer alle Optionen haben möchte, die der Druckertreiber bietet, soll eine andere Anwendung verwenden. Was mich vielleicht noch interessieren würde, wäre so eine Art digitaler Kontaktstreifen, also viele kleine Fotos auf einer Seite, aber das ist nicht erste Priorität. Was ich gern hätte: eine Klasse Print_preview, die die Fotos, die zum Drucken ausgewählt sind, anzeigt. Ablauf: wenn der User ein Foto auswählt, wird vom Dateimeister die Klasse initalisiert. Diese zeigt ein Fenster mit einer Canvas. Das Foto erscheint oben links. Bei jedem weiteren vom User zum Druck ausgewählten Foto wird dieses in der Print_preview angezeigt, indem der Dateimeister print_preview.add_photo aufruft. Dieses wird dann rechts neben dem letzten angezeigten Foto in der Canvas eingefügt usw. Die canvas soll über Parameter gesteuert, m Zeilen und n Spalten aufweisen. Die Fotos sollen so skaliert werden, dass sie alle dieselbe Höhe haben. Die canvas soll über horizontale und vertikale Scrollbars verfügen. Es soll möglich sein, 1...n Fotos durch linken mausclick auszuwählen. Strg-left-mouseclick soll die Auswahl ergänzen, ohne Steuerung soll das die Auswahl aufgehoben werden und nur das angeklickte Foto ausgewählt werden. Die Auswahl soll bei jedem Foto an einem gepunkteten roten Rahmen (rechteck) erkennbar sein, der (einstellbar) jeweils 5% vom jeweiligen Bildrand angezeigt wird. Es soll folgende Buttons geben:</w:t>
+      </w:r>
+    </w:p>
+    <w:p>
+      <w:r>
+        <w:t>Delete selected -&gt; löscht die ausgewählten Fotos aus der Canvas, diese wird lückenlos ohne die selektierten Fotos neu aufgebaut.</w:t>
+      </w:r>
+    </w:p>
+    <w:p>
+      <w:r>
+        <w:t>Print selected -&gt; druckt die selektierten Fotos</w:t>
       </w:r>
     </w:p>
     <w:p>
@@ -135,201 +23,34 @@
       </w:r>
     </w:p>
     <w:p>
-      <w:proofErr w:type="spellStart"/>
-      <w:r>
-        <w:t>Undo</w:t>
-      </w:r>
-      <w:proofErr w:type="spellEnd"/>
-      <w:r>
-        <w:t xml:space="preserve">: widerruft </w:t>
-      </w:r>
-      <w:proofErr w:type="spellStart"/>
-      <w:r>
-        <w:t>select</w:t>
-      </w:r>
-      <w:proofErr w:type="spellEnd"/>
-      <w:r>
-        <w:t xml:space="preserve"> / </w:t>
-      </w:r>
-      <w:proofErr w:type="spellStart"/>
-      <w:r>
-        <w:t>unselect</w:t>
-      </w:r>
-      <w:proofErr w:type="spellEnd"/>
-      <w:r>
-        <w:t>-Aktionen</w:t>
-      </w:r>
-    </w:p>
-    <w:p>
-      <w:proofErr w:type="spellStart"/>
-      <w:r>
-        <w:t>Redo</w:t>
-      </w:r>
-      <w:proofErr w:type="spellEnd"/>
-      <w:r>
-        <w:t xml:space="preserve">: umgekehrt. </w:t>
-      </w:r>
-      <w:proofErr w:type="spellStart"/>
-      <w:r>
-        <w:t>Undo</w:t>
-      </w:r>
-      <w:proofErr w:type="spellEnd"/>
-      <w:r>
-        <w:t xml:space="preserve"> / </w:t>
-      </w:r>
-      <w:proofErr w:type="spellStart"/>
-      <w:r>
-        <w:t>Redo</w:t>
-      </w:r>
-      <w:proofErr w:type="spellEnd"/>
-      <w:r>
-        <w:t xml:space="preserve"> Aktionen sollen nicht begrenzt sein. </w:t>
-      </w:r>
-    </w:p>
-    <w:p>
-      <w:proofErr w:type="spellStart"/>
-      <w:r>
-        <w:t>Choose</w:t>
-      </w:r>
-      <w:proofErr w:type="spellEnd"/>
-      <w:r>
-        <w:t xml:space="preserve"> Printer -&gt; einen Drucker aus einer </w:t>
-      </w:r>
-      <w:proofErr w:type="spellStart"/>
-      <w:r>
-        <w:t>Listbox</w:t>
-      </w:r>
-      <w:proofErr w:type="spellEnd"/>
-      <w:r>
-        <w:t xml:space="preserve"> der verfügbaren Drucker auswählen. </w:t>
-      </w:r>
-    </w:p>
-    <w:p>
-      <w:r>
-        <w:t xml:space="preserve">Der ausgewählte Drucker soll in einem Label dargestellt werden. Beim Aufruf von </w:t>
-      </w:r>
-      <w:proofErr w:type="spellStart"/>
-      <w:r>
-        <w:t>Print_preview</w:t>
-      </w:r>
-      <w:proofErr w:type="spellEnd"/>
-      <w:r>
-        <w:t xml:space="preserve"> kann ein Drucker mitgegeben werden. Ist das der Fall, wird dieser übernommen und im Label angezeigt. Beim Aufruf einer der beiden Druckfunktionen soll geprüft werden, ob der Drucker mitgegeben oder durch "</w:t>
-      </w:r>
-      <w:proofErr w:type="spellStart"/>
-      <w:r>
-        <w:t>choose</w:t>
-      </w:r>
-      <w:proofErr w:type="spellEnd"/>
-      <w:r>
-        <w:t xml:space="preserve"> </w:t>
-      </w:r>
-      <w:proofErr w:type="spellStart"/>
-      <w:r>
-        <w:t>printer</w:t>
-      </w:r>
-      <w:proofErr w:type="spellEnd"/>
-      <w:r>
-        <w:t xml:space="preserve">" gewählt wurde. Falls nein, soll automatisch der Drucker-Auswahl-Dialog aufgehen (dieser kann vom User jederzeit neu gewählt werden). Layout: </w:t>
-      </w:r>
-      <w:proofErr w:type="spellStart"/>
-      <w:r>
-        <w:t>canvas</w:t>
-      </w:r>
-      <w:proofErr w:type="spellEnd"/>
-      <w:r>
-        <w:t xml:space="preserve"> mit </w:t>
-      </w:r>
-      <w:proofErr w:type="spellStart"/>
-      <w:r>
-        <w:t>scrollbars</w:t>
-      </w:r>
-      <w:proofErr w:type="spellEnd"/>
-      <w:r>
-        <w:t xml:space="preserve"> nimmt den gesamten oberen Teil ein (ca. 90 %), das soll einfach durch Ändern eines Parameters im Code geändert werden können. Buttons, und Label in sinnvoller Anordnung unter der </w:t>
-      </w:r>
-      <w:proofErr w:type="spellStart"/>
-      <w:r>
-        <w:t>canvas</w:t>
-      </w:r>
-      <w:proofErr w:type="spellEnd"/>
-      <w:r>
-        <w:t xml:space="preserve"> nebeneinander. Darin brauchen wir auch noch eine Checkbox, die den dry-run Modus aktiviert.</w:t>
-      </w:r>
-    </w:p>
-    <w:p>
-      <w:r>
-        <w:t xml:space="preserve">Delete / Print </w:t>
-      </w:r>
-      <w:proofErr w:type="spellStart"/>
-      <w:r>
-        <w:t>selected</w:t>
-      </w:r>
-      <w:proofErr w:type="spellEnd"/>
-      <w:r>
-        <w:t xml:space="preserve"> sollten nur </w:t>
-      </w:r>
-      <w:proofErr w:type="spellStart"/>
-      <w:r>
-        <w:t>enabled</w:t>
-      </w:r>
-      <w:proofErr w:type="spellEnd"/>
-      <w:r>
-        <w:t xml:space="preserve"> sein, falls mindestens ein Foto selektiert wurde. Und </w:t>
-      </w:r>
-      <w:proofErr w:type="spellStart"/>
-      <w:r>
-        <w:t>Undo</w:t>
-      </w:r>
-      <w:proofErr w:type="spellEnd"/>
-      <w:r>
-        <w:t xml:space="preserve"> / </w:t>
-      </w:r>
-      <w:proofErr w:type="spellStart"/>
-      <w:r>
-        <w:t>Redo</w:t>
-      </w:r>
-      <w:proofErr w:type="spellEnd"/>
-      <w:r>
-        <w:t xml:space="preserve"> nur falls es etwas gibt, das </w:t>
-      </w:r>
-      <w:proofErr w:type="spellStart"/>
-      <w:r>
-        <w:t>undo</w:t>
-      </w:r>
-      <w:proofErr w:type="spellEnd"/>
-      <w:r>
-        <w:t xml:space="preserve"> / </w:t>
-      </w:r>
-      <w:proofErr w:type="spellStart"/>
-      <w:r>
-        <w:t>redo</w:t>
-      </w:r>
-      <w:proofErr w:type="spellEnd"/>
-      <w:r>
-        <w:t xml:space="preserve"> ermöglicht (z.B. Stack </w:t>
-      </w:r>
-      <w:proofErr w:type="spellStart"/>
-      <w:r>
-        <w:t>len</w:t>
-      </w:r>
-      <w:proofErr w:type="spellEnd"/>
-      <w:r>
-        <w:t xml:space="preserve"> &gt; 0), aber das kannst Du besser.</w:t>
+      <w:r>
+        <w:t>Undo: widerruft select / unselect-Aktionen</w:t>
+      </w:r>
+    </w:p>
+    <w:p>
+      <w:r>
+        <w:t xml:space="preserve">Redo: umgekehrt. Undo / Redo Aktionen sollen nicht begrenzt sein. </w:t>
+      </w:r>
+    </w:p>
+    <w:p>
+      <w:r>
+        <w:t xml:space="preserve">Choose Printer -&gt; einen Drucker aus einer Listbox der verfügbaren Drucker auswählen. </w:t>
+      </w:r>
+    </w:p>
+    <w:p>
+      <w:r>
+        <w:t>Der ausgewählte Drucker soll in einem Label dargestellt werden. Beim Aufruf von Print_preview kann ein Drucker mitgegeben werden. Ist das der Fall, wird dieser übernommen und im Label angezeigt. Beim Aufruf einer der beiden Druckfunktionen soll geprüft werden, ob der Drucker mitgegeben oder durch "choose printer" gewählt wurde. Falls nein, soll automatisch der Drucker-Auswahl-Dialog aufgehen (dieser kann vom User jederzeit neu gewählt werden). Layout: canvas mit scrollbars nimmt den gesamten oberen Teil ein (ca. 90 %), das soll einfach durch Ändern eines Parameters im Code geändert werden können. Buttons, und Label in sinnvoller Anordnung unter der canvas nebeneinander. Darin brauchen wir auch noch eine Checkbox, die den dry-run Modus aktiviert.</w:t>
+      </w:r>
+    </w:p>
+    <w:p>
+      <w:r>
+        <w:t>Delete / Print selected sollten nur enabled sein, falls mindestens ein Foto selektiert wurde. Und Undo / Redo nur falls es etwas gibt, das undo / redo ermöglicht (z.B. Stack len &gt; 0), aber das kannst Du besser.</w:t>
       </w:r>
     </w:p>
     <w:p>
       <w:r>
         <w:lastRenderedPageBreak/>
-        <w:t xml:space="preserve">Das Fenster soll </w:t>
-      </w:r>
-      <w:proofErr w:type="spellStart"/>
-      <w:r>
-        <w:t>resizable</w:t>
-      </w:r>
-      <w:proofErr w:type="spellEnd"/>
-      <w:r>
-        <w:t xml:space="preserve"> sein und alles, also auch die angezeigten Bilder sollen entsprechend neu skaliert werden</w:t>
+        <w:t>Das Fenster soll resizable sein und alles, also auch die angezeigten Bilder sollen entsprechend neu skaliert werden</w:t>
       </w:r>
     </w:p>
     <w:p>
@@ -381,15 +102,7 @@
         <w:t>Strg-Klick auf ein bereits selektiertes Foto</w:t>
       </w:r>
       <w:r>
-        <w:t xml:space="preserve"> es abwählen (</w:t>
-      </w:r>
-      <w:proofErr w:type="spellStart"/>
-      <w:r>
-        <w:t>Toggle</w:t>
-      </w:r>
-      <w:proofErr w:type="spellEnd"/>
-      <w:r>
-        <w:t>), oder reicht dir "nur hinzufügen" wie jetzt umgesetzt?</w:t>
+        <w:t xml:space="preserve"> es abwählen (Toggle), oder reicht dir "nur hinzufügen" wie jetzt umgesetzt?</w:t>
       </w:r>
     </w:p>
     <w:p/>
@@ -400,15 +113,31 @@
     </w:p>
     <w:p>
       <w:r>
-        <w:t xml:space="preserve">zu 2: </w:t>
-      </w:r>
-      <w:proofErr w:type="spellStart"/>
-      <w:r>
-        <w:t>Toggle</w:t>
-      </w:r>
-      <w:proofErr w:type="spellEnd"/>
-      <w:r>
-        <w:t>-Verhalten bei Strg-Click.</w:t>
+        <w:t>zu 2: Toggle-Verhalten bei Strg-Click.</w:t>
+      </w:r>
+    </w:p>
+    <w:p/>
+    <w:p>
+      <w:r>
+        <w:t>Ergänzung 24.9.2026:</w:t>
+      </w:r>
+      <w:r>
+        <w:t xml:space="preserve"> Anfrage an deepseek</w:t>
+      </w:r>
+    </w:p>
+    <w:p>
+      <w:r>
+        <w:t xml:space="preserve">könntest Du etwas für mich überprüfen? Dateimeister_support ist die Hauptanwendung. Es geht um die Drucklogik. </w:t>
+      </w:r>
+    </w:p>
+    <w:p>
+      <w:r>
+        <w:t>Video: ein PrintPreview kann nur in einem MyFSVideo-Fenster erzeugt werden. Ist das der Fall, soll dieses von allen anderen Video-Fenstern weiter verwendet werden, egal ob sie durch Dateimeister_support oder durch Dateimeister_duplicates erstellt wurden.</w:t>
+      </w:r>
+    </w:p>
+    <w:p>
+      <w:r>
+        <w:t>nich Video: PrintPreview kann von Dateimeister_support erzeugt werden, wenn die Print-Funktion für ein Bild aufgerufen wird. Dieser soll immer wiederverwendet werden, solange der User ihn nicht schließt. Es fehlt noch ein Print Button in MYFSImage und ein Kontextmenü-Item in Dateimeister_duplicates. Dateimeister_duplicates kann ein eigenes PrintPreview erstellen, wenn das mitgegebene None war. Dieses soll dann von allen anderen (auch von Dateimeister_support) weiter verwendet werden. Dazu müsste Dateimeister_duplicates rgendetwas tun (Callback / Event?), das Dateimeister_support benachrichtigt, so dass dieser den PrintPreview übernehmen (in das dafür vorgesehene dict eintragen) kann. Kannst Du das überprüfen und die Sourcen erweitern?</w:t>
       </w:r>
     </w:p>
     <w:p/>

</xml_diff>

<commit_message>
Dateimeister_support: fix a bug in stop_all_players (imagetype), create_widgets_from_dict support ttk for listbox
</commit_message>
<xml_diff>
--- a/Requirement Print Preview.docx
+++ b/Requirement Print Preview.docx
@@ -4,17 +4,129 @@
   <w:body>
     <w:p>
       <w:r>
-        <w:t>ok, danke! Zurück zum Dateimeister. Mit der Druckfunktion bin ich zufrieden, randlos ist nicht nötig. Wer alle Optionen haben möchte, die der Druckertreiber bietet, soll eine andere Anwendung verwenden. Was mich vielleicht noch interessieren würde, wäre so eine Art digitaler Kontaktstreifen, also viele kleine Fotos auf einer Seite, aber das ist nicht erste Priorität. Was ich gern hätte: eine Klasse Print_preview, die die Fotos, die zum Drucken ausgewählt sind, anzeigt. Ablauf: wenn der User ein Foto auswählt, wird vom Dateimeister die Klasse initalisiert. Diese zeigt ein Fenster mit einer Canvas. Das Foto erscheint oben links. Bei jedem weiteren vom User zum Druck ausgewählten Foto wird dieses in der Print_preview angezeigt, indem der Dateimeister print_preview.add_photo aufruft. Dieses wird dann rechts neben dem letzten angezeigten Foto in der Canvas eingefügt usw. Die canvas soll über Parameter gesteuert, m Zeilen und n Spalten aufweisen. Die Fotos sollen so skaliert werden, dass sie alle dieselbe Höhe haben. Die canvas soll über horizontale und vertikale Scrollbars verfügen. Es soll möglich sein, 1...n Fotos durch linken mausclick auszuwählen. Strg-left-mouseclick soll die Auswahl ergänzen, ohne Steuerung soll das die Auswahl aufgehoben werden und nur das angeklickte Foto ausgewählt werden. Die Auswahl soll bei jedem Foto an einem gepunkteten roten Rahmen (rechteck) erkennbar sein, der (einstellbar) jeweils 5% vom jeweiligen Bildrand angezeigt wird. Es soll folgende Buttons geben:</w:t>
-      </w:r>
-    </w:p>
-    <w:p>
-      <w:r>
-        <w:t>Delete selected -&gt; löscht die ausgewählten Fotos aus der Canvas, diese wird lückenlos ohne die selektierten Fotos neu aufgebaut.</w:t>
-      </w:r>
-    </w:p>
-    <w:p>
-      <w:r>
-        <w:t>Print selected -&gt; druckt die selektierten Fotos</w:t>
+        <w:t xml:space="preserve">ok, danke! Zurück zum Dateimeister. Mit der Druckfunktion bin ich zufrieden, randlos ist nicht nötig. Wer alle Optionen haben möchte, die der Druckertreiber bietet, soll eine andere Anwendung verwenden. Was mich vielleicht noch interessieren würde, wäre so eine Art digitaler Kontaktstreifen, also viele kleine Fotos auf einer Seite, aber das ist nicht erste Priorität. Was ich gern hätte: eine Klasse </w:t>
+      </w:r>
+      <w:proofErr w:type="spellStart"/>
+      <w:r>
+        <w:t>Print_preview</w:t>
+      </w:r>
+      <w:proofErr w:type="spellEnd"/>
+      <w:r>
+        <w:t xml:space="preserve">, die die Fotos, die zum Drucken ausgewählt sind, anzeigt. Ablauf: wenn der User ein Foto auswählt, wird vom Dateimeister die Klasse </w:t>
+      </w:r>
+      <w:proofErr w:type="spellStart"/>
+      <w:r>
+        <w:t>initalisiert</w:t>
+      </w:r>
+      <w:proofErr w:type="spellEnd"/>
+      <w:r>
+        <w:t xml:space="preserve">. Diese zeigt ein Fenster mit einer Canvas. Das Foto erscheint oben links. Bei jedem weiteren vom User zum Druck ausgewählten Foto wird dieses </w:t>
+      </w:r>
+      <w:proofErr w:type="gramStart"/>
+      <w:r>
+        <w:t xml:space="preserve">in der </w:t>
+      </w:r>
+      <w:proofErr w:type="spellStart"/>
+      <w:r>
+        <w:t>Print</w:t>
+      </w:r>
+      <w:proofErr w:type="gramEnd"/>
+      <w:r>
+        <w:t>_preview</w:t>
+      </w:r>
+      <w:proofErr w:type="spellEnd"/>
+      <w:r>
+        <w:t xml:space="preserve"> angezeigt, indem der Dateimeister </w:t>
+      </w:r>
+      <w:proofErr w:type="spellStart"/>
+      <w:r>
+        <w:t>print_preview.add_photo</w:t>
+      </w:r>
+      <w:proofErr w:type="spellEnd"/>
+      <w:r>
+        <w:t xml:space="preserve"> aufruft. Dieses wird dann rechts neben dem letzten angezeigten Foto in der Canvas eingefügt usw. Die </w:t>
+      </w:r>
+      <w:proofErr w:type="spellStart"/>
+      <w:r>
+        <w:t>canvas</w:t>
+      </w:r>
+      <w:proofErr w:type="spellEnd"/>
+      <w:r>
+        <w:t xml:space="preserve"> soll über Parameter gesteuert, m Zeilen und n Spalten aufweisen. Die Fotos sollen so skaliert werden, dass sie alle dieselbe Höhe haben. Die </w:t>
+      </w:r>
+      <w:proofErr w:type="spellStart"/>
+      <w:r>
+        <w:t>canvas</w:t>
+      </w:r>
+      <w:proofErr w:type="spellEnd"/>
+      <w:r>
+        <w:t xml:space="preserve"> soll über horizontale und vertikale </w:t>
+      </w:r>
+      <w:proofErr w:type="spellStart"/>
+      <w:r>
+        <w:t>Scrollbars</w:t>
+      </w:r>
+      <w:proofErr w:type="spellEnd"/>
+      <w:r>
+        <w:t xml:space="preserve"> verfügen. Es soll möglich sein, 1...n Fotos durch linken </w:t>
+      </w:r>
+      <w:proofErr w:type="spellStart"/>
+      <w:r>
+        <w:t>mausclick</w:t>
+      </w:r>
+      <w:proofErr w:type="spellEnd"/>
+      <w:r>
+        <w:t xml:space="preserve"> auszuwählen. Strg-</w:t>
+      </w:r>
+      <w:proofErr w:type="spellStart"/>
+      <w:r>
+        <w:t>left</w:t>
+      </w:r>
+      <w:proofErr w:type="spellEnd"/>
+      <w:r>
+        <w:t>-</w:t>
+      </w:r>
+      <w:proofErr w:type="spellStart"/>
+      <w:r>
+        <w:t>mouseclick</w:t>
+      </w:r>
+      <w:proofErr w:type="spellEnd"/>
+      <w:r>
+        <w:t xml:space="preserve"> soll die Auswahl ergänzen, ohne Steuerung soll das die Auswahl aufgehoben werden und nur das angeklickte Foto ausgewählt werden. Die Auswahl soll bei jedem Foto an einem gepunkteten roten Rahmen (</w:t>
+      </w:r>
+      <w:proofErr w:type="spellStart"/>
+      <w:r>
+        <w:t>rechteck</w:t>
+      </w:r>
+      <w:proofErr w:type="spellEnd"/>
+      <w:r>
+        <w:t>) erkennbar sein, der (einstellbar) jeweils 5% vom jeweiligen Bildrand angezeigt wird. Es soll folgende Buttons geben:</w:t>
+      </w:r>
+    </w:p>
+    <w:p>
+      <w:r>
+        <w:t xml:space="preserve">Delete </w:t>
+      </w:r>
+      <w:proofErr w:type="spellStart"/>
+      <w:r>
+        <w:t>selected</w:t>
+      </w:r>
+      <w:proofErr w:type="spellEnd"/>
+      <w:r>
+        <w:t xml:space="preserve"> -&gt; löscht die ausgewählten Fotos aus der Canvas, diese wird lückenlos ohne die selektierten Fotos neu aufgebaut.</w:t>
+      </w:r>
+    </w:p>
+    <w:p>
+      <w:r>
+        <w:t xml:space="preserve">Print </w:t>
+      </w:r>
+      <w:proofErr w:type="spellStart"/>
+      <w:r>
+        <w:t>selected</w:t>
+      </w:r>
+      <w:proofErr w:type="spellEnd"/>
+      <w:r>
+        <w:t xml:space="preserve"> -&gt; druckt die selektierten Fotos</w:t>
       </w:r>
     </w:p>
     <w:p>
@@ -23,34 +135,201 @@
       </w:r>
     </w:p>
     <w:p>
-      <w:r>
-        <w:t>Undo: widerruft select / unselect-Aktionen</w:t>
-      </w:r>
-    </w:p>
-    <w:p>
-      <w:r>
-        <w:t xml:space="preserve">Redo: umgekehrt. Undo / Redo Aktionen sollen nicht begrenzt sein. </w:t>
-      </w:r>
-    </w:p>
-    <w:p>
-      <w:r>
-        <w:t xml:space="preserve">Choose Printer -&gt; einen Drucker aus einer Listbox der verfügbaren Drucker auswählen. </w:t>
-      </w:r>
-    </w:p>
-    <w:p>
-      <w:r>
-        <w:t>Der ausgewählte Drucker soll in einem Label dargestellt werden. Beim Aufruf von Print_preview kann ein Drucker mitgegeben werden. Ist das der Fall, wird dieser übernommen und im Label angezeigt. Beim Aufruf einer der beiden Druckfunktionen soll geprüft werden, ob der Drucker mitgegeben oder durch "choose printer" gewählt wurde. Falls nein, soll automatisch der Drucker-Auswahl-Dialog aufgehen (dieser kann vom User jederzeit neu gewählt werden). Layout: canvas mit scrollbars nimmt den gesamten oberen Teil ein (ca. 90 %), das soll einfach durch Ändern eines Parameters im Code geändert werden können. Buttons, und Label in sinnvoller Anordnung unter der canvas nebeneinander. Darin brauchen wir auch noch eine Checkbox, die den dry-run Modus aktiviert.</w:t>
-      </w:r>
-    </w:p>
-    <w:p>
-      <w:r>
-        <w:t>Delete / Print selected sollten nur enabled sein, falls mindestens ein Foto selektiert wurde. Und Undo / Redo nur falls es etwas gibt, das undo / redo ermöglicht (z.B. Stack len &gt; 0), aber das kannst Du besser.</w:t>
+      <w:proofErr w:type="spellStart"/>
+      <w:r>
+        <w:t>Undo</w:t>
+      </w:r>
+      <w:proofErr w:type="spellEnd"/>
+      <w:r>
+        <w:t xml:space="preserve">: widerruft </w:t>
+      </w:r>
+      <w:proofErr w:type="spellStart"/>
+      <w:r>
+        <w:t>select</w:t>
+      </w:r>
+      <w:proofErr w:type="spellEnd"/>
+      <w:r>
+        <w:t xml:space="preserve"> / </w:t>
+      </w:r>
+      <w:proofErr w:type="spellStart"/>
+      <w:r>
+        <w:t>unselect</w:t>
+      </w:r>
+      <w:proofErr w:type="spellEnd"/>
+      <w:r>
+        <w:t>-Aktionen</w:t>
+      </w:r>
+    </w:p>
+    <w:p>
+      <w:proofErr w:type="spellStart"/>
+      <w:r>
+        <w:t>Redo</w:t>
+      </w:r>
+      <w:proofErr w:type="spellEnd"/>
+      <w:r>
+        <w:t xml:space="preserve">: umgekehrt. </w:t>
+      </w:r>
+      <w:proofErr w:type="spellStart"/>
+      <w:r>
+        <w:t>Undo</w:t>
+      </w:r>
+      <w:proofErr w:type="spellEnd"/>
+      <w:r>
+        <w:t xml:space="preserve"> / </w:t>
+      </w:r>
+      <w:proofErr w:type="spellStart"/>
+      <w:r>
+        <w:t>Redo</w:t>
+      </w:r>
+      <w:proofErr w:type="spellEnd"/>
+      <w:r>
+        <w:t xml:space="preserve"> Aktionen sollen nicht begrenzt sein. </w:t>
+      </w:r>
+    </w:p>
+    <w:p>
+      <w:proofErr w:type="spellStart"/>
+      <w:r>
+        <w:t>Choose</w:t>
+      </w:r>
+      <w:proofErr w:type="spellEnd"/>
+      <w:r>
+        <w:t xml:space="preserve"> Printer -&gt; einen Drucker aus einer </w:t>
+      </w:r>
+      <w:proofErr w:type="spellStart"/>
+      <w:r>
+        <w:t>Listbox</w:t>
+      </w:r>
+      <w:proofErr w:type="spellEnd"/>
+      <w:r>
+        <w:t xml:space="preserve"> der verfügbaren Drucker auswählen. </w:t>
+      </w:r>
+    </w:p>
+    <w:p>
+      <w:r>
+        <w:t xml:space="preserve">Der ausgewählte Drucker soll in einem Label dargestellt werden. Beim Aufruf von </w:t>
+      </w:r>
+      <w:proofErr w:type="spellStart"/>
+      <w:r>
+        <w:t>Print_preview</w:t>
+      </w:r>
+      <w:proofErr w:type="spellEnd"/>
+      <w:r>
+        <w:t xml:space="preserve"> kann ein Drucker mitgegeben werden. Ist das der Fall, wird dieser übernommen und im Label angezeigt. Beim Aufruf einer der beiden Druckfunktionen soll geprüft werden, ob der Drucker mitgegeben oder durch "</w:t>
+      </w:r>
+      <w:proofErr w:type="spellStart"/>
+      <w:r>
+        <w:t>choose</w:t>
+      </w:r>
+      <w:proofErr w:type="spellEnd"/>
+      <w:r>
+        <w:t xml:space="preserve"> </w:t>
+      </w:r>
+      <w:proofErr w:type="spellStart"/>
+      <w:r>
+        <w:t>printer</w:t>
+      </w:r>
+      <w:proofErr w:type="spellEnd"/>
+      <w:r>
+        <w:t xml:space="preserve">" gewählt wurde. Falls nein, soll automatisch der Drucker-Auswahl-Dialog aufgehen (dieser kann vom User jederzeit neu gewählt werden). Layout: </w:t>
+      </w:r>
+      <w:proofErr w:type="spellStart"/>
+      <w:r>
+        <w:t>canvas</w:t>
+      </w:r>
+      <w:proofErr w:type="spellEnd"/>
+      <w:r>
+        <w:t xml:space="preserve"> mit </w:t>
+      </w:r>
+      <w:proofErr w:type="spellStart"/>
+      <w:r>
+        <w:t>scrollbars</w:t>
+      </w:r>
+      <w:proofErr w:type="spellEnd"/>
+      <w:r>
+        <w:t xml:space="preserve"> nimmt den gesamten oberen Teil ein (ca. 90 %), das soll einfach durch Ändern eines Parameters im Code geändert werden können. Buttons, und Label in sinnvoller Anordnung unter der </w:t>
+      </w:r>
+      <w:proofErr w:type="spellStart"/>
+      <w:r>
+        <w:t>canvas</w:t>
+      </w:r>
+      <w:proofErr w:type="spellEnd"/>
+      <w:r>
+        <w:t xml:space="preserve"> nebeneinander. Darin brauchen wir auch noch eine Checkbox, die den dry-run Modus aktiviert.</w:t>
+      </w:r>
+    </w:p>
+    <w:p>
+      <w:r>
+        <w:t xml:space="preserve">Delete / Print </w:t>
+      </w:r>
+      <w:proofErr w:type="spellStart"/>
+      <w:r>
+        <w:t>selected</w:t>
+      </w:r>
+      <w:proofErr w:type="spellEnd"/>
+      <w:r>
+        <w:t xml:space="preserve"> sollten nur </w:t>
+      </w:r>
+      <w:proofErr w:type="spellStart"/>
+      <w:r>
+        <w:t>enabled</w:t>
+      </w:r>
+      <w:proofErr w:type="spellEnd"/>
+      <w:r>
+        <w:t xml:space="preserve"> sein, falls mindestens ein Foto selektiert wurde. Und </w:t>
+      </w:r>
+      <w:proofErr w:type="spellStart"/>
+      <w:r>
+        <w:t>Undo</w:t>
+      </w:r>
+      <w:proofErr w:type="spellEnd"/>
+      <w:r>
+        <w:t xml:space="preserve"> / </w:t>
+      </w:r>
+      <w:proofErr w:type="spellStart"/>
+      <w:r>
+        <w:t>Redo</w:t>
+      </w:r>
+      <w:proofErr w:type="spellEnd"/>
+      <w:r>
+        <w:t xml:space="preserve"> nur falls es etwas gibt, das </w:t>
+      </w:r>
+      <w:proofErr w:type="spellStart"/>
+      <w:r>
+        <w:t>undo</w:t>
+      </w:r>
+      <w:proofErr w:type="spellEnd"/>
+      <w:r>
+        <w:t xml:space="preserve"> / </w:t>
+      </w:r>
+      <w:proofErr w:type="spellStart"/>
+      <w:r>
+        <w:t>redo</w:t>
+      </w:r>
+      <w:proofErr w:type="spellEnd"/>
+      <w:r>
+        <w:t xml:space="preserve"> ermöglicht (z.B. Stack </w:t>
+      </w:r>
+      <w:proofErr w:type="spellStart"/>
+      <w:r>
+        <w:t>len</w:t>
+      </w:r>
+      <w:proofErr w:type="spellEnd"/>
+      <w:r>
+        <w:t xml:space="preserve"> &gt; 0), aber das kannst Du besser.</w:t>
       </w:r>
     </w:p>
     <w:p>
       <w:r>
         <w:lastRenderedPageBreak/>
-        <w:t>Das Fenster soll resizable sein und alles, also auch die angezeigten Bilder sollen entsprechend neu skaliert werden</w:t>
+        <w:t xml:space="preserve">Das Fenster soll </w:t>
+      </w:r>
+      <w:proofErr w:type="spellStart"/>
+      <w:r>
+        <w:t>resizable</w:t>
+      </w:r>
+      <w:proofErr w:type="spellEnd"/>
+      <w:r>
+        <w:t xml:space="preserve"> sein und alles, also auch die angezeigten Bilder sollen entsprechend neu skaliert werden</w:t>
       </w:r>
     </w:p>
     <w:p>
@@ -102,7 +381,15 @@
         <w:t>Strg-Klick auf ein bereits selektiertes Foto</w:t>
       </w:r>
       <w:r>
-        <w:t xml:space="preserve"> es abwählen (Toggle), oder reicht dir "nur hinzufügen" wie jetzt umgesetzt?</w:t>
+        <w:t xml:space="preserve"> es abwählen (</w:t>
+      </w:r>
+      <w:proofErr w:type="spellStart"/>
+      <w:r>
+        <w:t>Toggle</w:t>
+      </w:r>
+      <w:proofErr w:type="spellEnd"/>
+      <w:r>
+        <w:t>), oder reicht dir "nur hinzufügen" wie jetzt umgesetzt?</w:t>
       </w:r>
     </w:p>
     <w:p/>
@@ -113,7 +400,15 @@
     </w:p>
     <w:p>
       <w:r>
-        <w:t>zu 2: Toggle-Verhalten bei Strg-Click.</w:t>
+        <w:t xml:space="preserve">zu 2: </w:t>
+      </w:r>
+      <w:proofErr w:type="spellStart"/>
+      <w:r>
+        <w:t>Toggle</w:t>
+      </w:r>
+      <w:proofErr w:type="spellEnd"/>
+      <w:r>
+        <w:t>-Verhalten bei Strg-Click.</w:t>
       </w:r>
     </w:p>
     <w:p/>
@@ -122,22 +417,307 @@
         <w:t>Ergänzung 24.9.2026:</w:t>
       </w:r>
       <w:r>
-        <w:t xml:space="preserve"> Anfrage an deepseek</w:t>
-      </w:r>
-    </w:p>
-    <w:p>
-      <w:r>
-        <w:t xml:space="preserve">könntest Du etwas für mich überprüfen? Dateimeister_support ist die Hauptanwendung. Es geht um die Drucklogik. </w:t>
-      </w:r>
-    </w:p>
-    <w:p>
-      <w:r>
-        <w:t>Video: ein PrintPreview kann nur in einem MyFSVideo-Fenster erzeugt werden. Ist das der Fall, soll dieses von allen anderen Video-Fenstern weiter verwendet werden, egal ob sie durch Dateimeister_support oder durch Dateimeister_duplicates erstellt wurden.</w:t>
-      </w:r>
-    </w:p>
-    <w:p>
-      <w:r>
-        <w:t>nich Video: PrintPreview kann von Dateimeister_support erzeugt werden, wenn die Print-Funktion für ein Bild aufgerufen wird. Dieser soll immer wiederverwendet werden, solange der User ihn nicht schließt. Es fehlt noch ein Print Button in MYFSImage und ein Kontextmenü-Item in Dateimeister_duplicates. Dateimeister_duplicates kann ein eigenes PrintPreview erstellen, wenn das mitgegebene None war. Dieses soll dann von allen anderen (auch von Dateimeister_support) weiter verwendet werden. Dazu müsste Dateimeister_duplicates rgendetwas tun (Callback / Event?), das Dateimeister_support benachrichtigt, so dass dieser den PrintPreview übernehmen (in das dafür vorgesehene dict eintragen) kann. Kannst Du das überprüfen und die Sourcen erweitern?</w:t>
+        <w:t xml:space="preserve"> Anfrage an </w:t>
+      </w:r>
+      <w:proofErr w:type="spellStart"/>
+      <w:r>
+        <w:t>deepseek</w:t>
+      </w:r>
+      <w:proofErr w:type="spellEnd"/>
+    </w:p>
+    <w:p>
+      <w:r>
+        <w:t xml:space="preserve">könntest Du etwas für mich überprüfen? </w:t>
+      </w:r>
+      <w:proofErr w:type="spellStart"/>
+      <w:r>
+        <w:t>Dateimeister_support</w:t>
+      </w:r>
+      <w:proofErr w:type="spellEnd"/>
+      <w:r>
+        <w:t xml:space="preserve"> ist die Hauptanwendung. Es geht um die Drucklogik. </w:t>
+      </w:r>
+    </w:p>
+    <w:p>
+      <w:r>
+        <w:t xml:space="preserve">Video: ein </w:t>
+      </w:r>
+      <w:proofErr w:type="spellStart"/>
+      <w:r>
+        <w:t>PrintPreview</w:t>
+      </w:r>
+      <w:proofErr w:type="spellEnd"/>
+      <w:r>
+        <w:t xml:space="preserve"> kann nur in einem </w:t>
+      </w:r>
+      <w:proofErr w:type="spellStart"/>
+      <w:r>
+        <w:t>MyFSVideo</w:t>
+      </w:r>
+      <w:proofErr w:type="spellEnd"/>
+      <w:r>
+        <w:t xml:space="preserve">-Fenster erzeugt werden. Ist das der Fall, soll dieses von allen anderen Video-Fenstern </w:t>
+      </w:r>
+      <w:proofErr w:type="gramStart"/>
+      <w:r>
+        <w:t>weiter verwendet</w:t>
+      </w:r>
+      <w:proofErr w:type="gramEnd"/>
+      <w:r>
+        <w:t xml:space="preserve"> werden, egal ob sie durch </w:t>
+      </w:r>
+      <w:proofErr w:type="spellStart"/>
+      <w:r>
+        <w:t>Dateimeister_support</w:t>
+      </w:r>
+      <w:proofErr w:type="spellEnd"/>
+      <w:r>
+        <w:t xml:space="preserve"> oder durch </w:t>
+      </w:r>
+      <w:proofErr w:type="spellStart"/>
+      <w:r>
+        <w:t>Dateimeister_duplicates</w:t>
+      </w:r>
+      <w:proofErr w:type="spellEnd"/>
+      <w:r>
+        <w:t xml:space="preserve"> erstellt wurden.</w:t>
+      </w:r>
+    </w:p>
+    <w:p>
+      <w:proofErr w:type="spellStart"/>
+      <w:r>
+        <w:t>nich</w:t>
+      </w:r>
+      <w:proofErr w:type="spellEnd"/>
+      <w:r>
+        <w:t xml:space="preserve"> Video: </w:t>
+      </w:r>
+      <w:proofErr w:type="spellStart"/>
+      <w:r>
+        <w:t>PrintPreview</w:t>
+      </w:r>
+      <w:proofErr w:type="spellEnd"/>
+      <w:r>
+        <w:t xml:space="preserve"> kann von </w:t>
+      </w:r>
+      <w:proofErr w:type="spellStart"/>
+      <w:r>
+        <w:t>Dateimeister_support</w:t>
+      </w:r>
+      <w:proofErr w:type="spellEnd"/>
+      <w:r>
+        <w:t xml:space="preserve"> erzeugt werden, wenn die Print-Funktion für ein Bild aufgerufen wird. Dieser soll immer wiederverwendet werden, solange der User ihn nicht schließt. Es fehlt noch ein Print Button in </w:t>
+      </w:r>
+      <w:proofErr w:type="spellStart"/>
+      <w:r>
+        <w:t>MYFSImage</w:t>
+      </w:r>
+      <w:proofErr w:type="spellEnd"/>
+      <w:r>
+        <w:t xml:space="preserve"> und ein Kontextmenü-Item in </w:t>
+      </w:r>
+      <w:proofErr w:type="spellStart"/>
+      <w:r>
+        <w:t>Dateimeister_duplicates</w:t>
+      </w:r>
+      <w:proofErr w:type="spellEnd"/>
+      <w:r>
+        <w:t xml:space="preserve">. </w:t>
+      </w:r>
+      <w:proofErr w:type="spellStart"/>
+      <w:r>
+        <w:t>Dateimeister_duplicates</w:t>
+      </w:r>
+      <w:proofErr w:type="spellEnd"/>
+      <w:r>
+        <w:t xml:space="preserve"> kann ein eigenes </w:t>
+      </w:r>
+      <w:proofErr w:type="spellStart"/>
+      <w:r>
+        <w:t>PrintPreview</w:t>
+      </w:r>
+      <w:proofErr w:type="spellEnd"/>
+      <w:r>
+        <w:t xml:space="preserve"> erstellen, wenn das mitgegebene None war. Dieses soll dann von allen anderen (auch von </w:t>
+      </w:r>
+      <w:proofErr w:type="spellStart"/>
+      <w:r>
+        <w:t>Dateimeister_support</w:t>
+      </w:r>
+      <w:proofErr w:type="spellEnd"/>
+      <w:r>
+        <w:t xml:space="preserve">) </w:t>
+      </w:r>
+      <w:proofErr w:type="gramStart"/>
+      <w:r>
+        <w:t>weiter verwendet</w:t>
+      </w:r>
+      <w:proofErr w:type="gramEnd"/>
+      <w:r>
+        <w:t xml:space="preserve"> werden. Dazu müsste </w:t>
+      </w:r>
+      <w:proofErr w:type="spellStart"/>
+      <w:r>
+        <w:t>Dateimeister_duplicates</w:t>
+      </w:r>
+      <w:proofErr w:type="spellEnd"/>
+      <w:r>
+        <w:t xml:space="preserve"> </w:t>
+      </w:r>
+      <w:proofErr w:type="spellStart"/>
+      <w:r>
+        <w:t>rgendetwas</w:t>
+      </w:r>
+      <w:proofErr w:type="spellEnd"/>
+      <w:r>
+        <w:t xml:space="preserve"> tun (Callback / Event?), das </w:t>
+      </w:r>
+      <w:proofErr w:type="spellStart"/>
+      <w:r>
+        <w:t>Dateimeister_support</w:t>
+      </w:r>
+      <w:proofErr w:type="spellEnd"/>
+      <w:r>
+        <w:t xml:space="preserve"> benachrichtigt, so dass dieser den </w:t>
+      </w:r>
+      <w:proofErr w:type="spellStart"/>
+      <w:r>
+        <w:t>PrintPreview</w:t>
+      </w:r>
+      <w:proofErr w:type="spellEnd"/>
+      <w:r>
+        <w:t xml:space="preserve"> übernehmen (in das dafür vorgesehene </w:t>
+      </w:r>
+      <w:proofErr w:type="spellStart"/>
+      <w:r>
+        <w:t>dict</w:t>
+      </w:r>
+      <w:proofErr w:type="spellEnd"/>
+      <w:r>
+        <w:t xml:space="preserve"> eintragen) kann. Kannst Du das überprüfen und </w:t>
+      </w:r>
+      <w:proofErr w:type="gramStart"/>
+      <w:r>
+        <w:t>die Sourcen</w:t>
+      </w:r>
+      <w:proofErr w:type="gramEnd"/>
+      <w:r>
+        <w:t xml:space="preserve"> erweitern?</w:t>
+      </w:r>
+    </w:p>
+    <w:p>
+      <w:r>
+        <w:t>27.9.2026 Anfrage an Claude:</w:t>
+      </w:r>
+    </w:p>
+    <w:p>
+      <w:r>
+        <w:t xml:space="preserve">Guten Abend, heute geht mir ein Gedanke zum Dateimeister durch den Kopf. Die Anzeige, Generierung usw. wird immer nur für einen Imagetype (VIDEO, </w:t>
+      </w:r>
+      <w:proofErr w:type="gramStart"/>
+      <w:r>
+        <w:t>JPEG,...</w:t>
+      </w:r>
+      <w:proofErr w:type="gramEnd"/>
+      <w:r>
+        <w:t xml:space="preserve">) </w:t>
+      </w:r>
+      <w:r>
+        <w:lastRenderedPageBreak/>
+        <w:t xml:space="preserve">durchgeführt. Das wird gesteuert durch die "Kameras", die in </w:t>
+      </w:r>
+      <w:proofErr w:type="spellStart"/>
+      <w:r>
+        <w:t>MyCameraTreeview</w:t>
+      </w:r>
+      <w:proofErr w:type="spellEnd"/>
+      <w:r>
+        <w:t xml:space="preserve"> vom User angelegt werden. Den Gedanken finde ich nach wie vor ganz gut. Der User wählt dann auf der Hauptseite eine Kamera aus und die zugehörigen Images / Videos werden selektiert und es können Copy / </w:t>
+      </w:r>
+      <w:proofErr w:type="spellStart"/>
+      <w:r>
+        <w:t>Delet</w:t>
+      </w:r>
+      <w:proofErr w:type="spellEnd"/>
+      <w:r>
+        <w:t xml:space="preserve">-Befehle generiert werden. Der Gedanke ist, dass der User immer volle Transparenz und Kontrolle hat. Allerdings finde ich immer mehr, dass der User auch die Möglichkeit haben sollte, alle Dateitypen für eine Kamera auf einmal zu verarbeiten, dass also in der </w:t>
+      </w:r>
+      <w:proofErr w:type="spellStart"/>
+      <w:r>
+        <w:t>canva</w:t>
+      </w:r>
+      <w:proofErr w:type="spellEnd"/>
+      <w:r>
+        <w:t xml:space="preserve"> </w:t>
+      </w:r>
+      <w:proofErr w:type="spellStart"/>
+      <w:r>
+        <w:t>stills</w:t>
+      </w:r>
+      <w:proofErr w:type="spellEnd"/>
+      <w:r>
+        <w:t xml:space="preserve"> und </w:t>
+      </w:r>
+      <w:proofErr w:type="spellStart"/>
+      <w:r>
+        <w:t>videos</w:t>
+      </w:r>
+      <w:proofErr w:type="spellEnd"/>
+      <w:r>
+        <w:t xml:space="preserve"> angezeigt werden können. Technisch stelle ich mir eine Checkbox vor, in der der User "All" setzen kann, dann werden alle in der </w:t>
+      </w:r>
+      <w:proofErr w:type="spellStart"/>
+      <w:r>
+        <w:t>Listbox</w:t>
+      </w:r>
+      <w:proofErr w:type="spellEnd"/>
+      <w:r>
+        <w:t xml:space="preserve"> aufgeführten Typen generiert. Das größte Hindernis aus meiner Sicht ist dabei, dass vieles von </w:t>
+      </w:r>
+      <w:proofErr w:type="spellStart"/>
+      <w:r>
+        <w:t>Globals.imagetype</w:t>
+      </w:r>
+      <w:proofErr w:type="spellEnd"/>
+      <w:r>
+        <w:t xml:space="preserve"> gesteuert wird. Das bedeutet, dass in allen Fällen, wo der imagetype relevant ist, dieser nicht aus </w:t>
+      </w:r>
+      <w:proofErr w:type="spellStart"/>
+      <w:r>
+        <w:t>Globals</w:t>
+      </w:r>
+      <w:proofErr w:type="spellEnd"/>
+      <w:r>
+        <w:t xml:space="preserve"> geholt wird, sondern aus dem </w:t>
+      </w:r>
+      <w:proofErr w:type="spellStart"/>
+      <w:r>
+        <w:t>thumbnail</w:t>
+      </w:r>
+      <w:proofErr w:type="spellEnd"/>
+      <w:r>
+        <w:t xml:space="preserve">. Es gibt 3 Sourcen, in denen </w:t>
+      </w:r>
+      <w:proofErr w:type="spellStart"/>
+      <w:r>
+        <w:t>Globals.imagetype</w:t>
+      </w:r>
+      <w:proofErr w:type="spellEnd"/>
+      <w:r>
+        <w:t xml:space="preserve"> verwendet wird. Die habe ich angehängt. Wie wäre Dein Vorschlag für eine Umsetzung?</w:t>
+      </w:r>
+    </w:p>
+    <w:p>
+      <w:r>
+        <w:t xml:space="preserve">Wir haben beschlossen, den imagetype beizubehalten und die Semantik aus ‚VIDEO‘ herauszunehmen. Wir führen zusätzlich ins Datenmodell </w:t>
+      </w:r>
+      <w:proofErr w:type="spellStart"/>
+      <w:r>
+        <w:t>rendertype</w:t>
+      </w:r>
+      <w:proofErr w:type="spellEnd"/>
+      <w:r>
+        <w:t xml:space="preserve"> (VIDEO / STILL) ein.</w:t>
       </w:r>
     </w:p>
     <w:p/>
@@ -875,7 +1455,6 @@
   <w:style w:type="character" w:default="1" w:styleId="Absatz-Standardschriftart">
     <w:name w:val="Default Paragraph Font"/>
     <w:uiPriority w:val="1"/>
-    <w:semiHidden/>
     <w:unhideWhenUsed/>
   </w:style>
   <w:style w:type="table" w:default="1" w:styleId="NormaleTabelle">

</xml_diff>